<commit_message>
Update Word document with page breaks and Table of Contents
</commit_message>
<xml_diff>
--- a/PANDUAN-LENGKAP-UKK-TKJ-P4.docx
+++ b/PANDUAN-LENGKAP-UKK-TKJ-P4.docx
@@ -2,6 +2,32 @@
 <file path=word/document.xml><?xml version="1.0" encoding="utf-8"?>
 <w:document xmlns:w="http://schemas.openxmlformats.org/wordprocessingml/2006/main" xmlns:m="http://schemas.openxmlformats.org/officeDocument/2006/math" xmlns:r="http://schemas.openxmlformats.org/officeDocument/2006/relationships" xmlns:o="urn:schemas-microsoft-com:office:office" xmlns:v="urn:schemas-microsoft-com:vml" xmlns:w10="urn:schemas-microsoft-com:office:word" xmlns:a="http://schemas.openxmlformats.org/drawingml/2006/main" xmlns:pic="http://schemas.openxmlformats.org/drawingml/2006/picture" xmlns:wp="http://schemas.openxmlformats.org/drawingml/2006/wordprocessingDrawing">
   <w:body>
+    <w:sdt>
+      <w:sdtPr>
+        <w:docPartObj>
+          <w:docPartGallery w:val="Table of Contents"/>
+          <w:docPartUnique/>
+        </w:docPartObj>
+      </w:sdtPr>
+      <w:sdtContent>
+        <w:p>
+          <w:pPr>
+            <w:pStyle w:val="TOCHeading"/>
+          </w:pPr>
+          <w:r>
+            <w:t xml:space="preserve">Table of Contents</w:t>
+          </w:r>
+        </w:p>
+        <w:p>
+          <w:r>
+            <w:fldChar w:fldCharType="begin" w:dirty="true"/>
+            <w:instrText xml:space="preserve">TOC \o "1-3" \h \z \u</w:instrText>
+            <w:fldChar w:fldCharType="separate"/>
+            <w:fldChar w:fldCharType="end"/>
+          </w:r>
+        </w:p>
+      </w:sdtContent>
+    </w:sdt>
     <w:bookmarkStart w:id="21" w:name="X0bb31041de3707e124924803bf0987e8379ddf0"/>
     <w:p>
       <w:pPr>
@@ -1234,6 +1260,11 @@
         <w:t xml:space="preserve">____________________</w:t>
       </w:r>
     </w:p>
+    <w:p>
+      <w:r>
+        <w:br w:type="page"/>
+      </w:r>
+    </w:p>
     <w:bookmarkEnd w:id="18"/>
     <w:bookmarkEnd w:id="19"/>
     <w:bookmarkEnd w:id="20"/>
@@ -1611,6 +1642,11 @@
         <w:t xml:space="preserve">.</w:t>
       </w:r>
     </w:p>
+    <w:p>
+      <w:r>
+        <w:br w:type="page"/>
+      </w:r>
+    </w:p>
     <w:bookmarkEnd w:id="27"/>
     <w:bookmarkEnd w:id="28"/>
     <w:bookmarkEnd w:id="29"/>
@@ -2258,6 +2294,11 @@
         <w:t xml:space="preserve">agar tes koneksi tidak diblokir.</w:t>
       </w:r>
     </w:p>
+    <w:p>
+      <w:r>
+        <w:br w:type="page"/>
+      </w:r>
+    </w:p>
     <w:bookmarkEnd w:id="33"/>
     <w:bookmarkEnd w:id="34"/>
     <w:bookmarkEnd w:id="35"/>
@@ -3109,6 +3150,11 @@
       </w:r>
       <w:r>
         <w:t xml:space="preserve">Pastikan tidak ada kesalahan spasi dalam file YAML karena format ini sangat sensitif terhadap spasi/indentasi.</w:t>
+      </w:r>
+    </w:p>
+    <w:p>
+      <w:r>
+        <w:br w:type="page"/>
       </w:r>
     </w:p>
     <w:bookmarkEnd w:id="41"/>

</xml_diff>

<commit_message>
Add File & Printer sharing guides for Windows 11 and Debian 13 to Word document
</commit_message>
<xml_diff>
--- a/PANDUAN-LENGKAP-UKK-TKJ-P4.docx
+++ b/PANDUAN-LENGKAP-UKK-TKJ-P4.docx
@@ -4088,9 +4088,1761 @@
         <w:t xml:space="preserve">.</w:t>
       </w:r>
     </w:p>
+    <w:p>
+      <w:r>
+        <w:br w:type="page"/>
+      </w:r>
+    </w:p>
     <w:bookmarkEnd w:id="49"/>
     <w:bookmarkEnd w:id="50"/>
     <w:bookmarkEnd w:id="51"/>
+    <w:bookmarkStart w:id="63" w:name="Xf776d0db9b1bb7a74a5ce1849a528ca64f4d033"/>
+    <w:p>
+      <w:pPr>
+        <w:pStyle w:val="Heading1"/>
+      </w:pPr>
+      <w:r>
+        <w:t xml:space="preserve">Panduan Sharing File &amp; Printer - Windows 11</w:t>
+      </w:r>
+    </w:p>
+    <w:bookmarkStart w:id="62" w:name="berbagi-sumber-daya-di-jaringan-lokal"/>
+    <w:p>
+      <w:pPr>
+        <w:pStyle w:val="Heading2"/>
+      </w:pPr>
+      <w:r>
+        <w:t xml:space="preserve">Berbagi Sumber Daya di Jaringan Lokal</w:t>
+      </w:r>
+    </w:p>
+    <w:p>
+      <w:pPr>
+        <w:pStyle w:val="FirstParagraph"/>
+      </w:pPr>
+      <w:r>
+        <w:rPr>
+          <w:b/>
+          <w:bCs/>
+        </w:rPr>
+        <w:t xml:space="preserve">Tujuan:</w:t>
+      </w:r>
+      <w:r>
+        <w:t xml:space="preserve"> </w:t>
+      </w:r>
+      <w:r>
+        <w:t xml:space="preserve">Mengkonfigurasi Windows 11 agar dapat berbagi folder dan printer dengan perangkat lain dalam satu LAN.</w:t>
+      </w:r>
+    </w:p>
+    <w:p>
+      <w:r>
+        <w:pict>
+          <v:rect style="width:0;height:1.5pt" o:hralign="center" o:hrstd="t" o:hr="t"/>
+        </w:pict>
+      </w:r>
+    </w:p>
+    <w:bookmarkStart w:id="52" w:name="persiapan-mengaktifkan-network-discovery"/>
+    <w:p>
+      <w:pPr>
+        <w:pStyle w:val="Heading3"/>
+      </w:pPr>
+      <w:r>
+        <w:t xml:space="preserve">1. Persiapan: Mengaktifkan Network Discovery</w:t>
+      </w:r>
+    </w:p>
+    <w:p>
+      <w:pPr>
+        <w:pStyle w:val="FirstParagraph"/>
+      </w:pPr>
+      <w:r>
+        <w:t xml:space="preserve">Agar PC Anda terlihat oleh perangkat lain:</w:t>
+      </w:r>
+      <w:r>
+        <w:t xml:space="preserve"> </w:t>
+      </w:r>
+      <w:r>
+        <w:t xml:space="preserve">1. Buka</w:t>
+      </w:r>
+      <w:r>
+        <w:t xml:space="preserve"> </w:t>
+      </w:r>
+      <w:r>
+        <w:rPr>
+          <w:b/>
+          <w:bCs/>
+        </w:rPr>
+        <w:t xml:space="preserve">Settings</w:t>
+      </w:r>
+      <w:r>
+        <w:t xml:space="preserve"> </w:t>
+      </w:r>
+      <w:r>
+        <w:t xml:space="preserve">&gt;</w:t>
+      </w:r>
+      <w:r>
+        <w:t xml:space="preserve"> </w:t>
+      </w:r>
+      <w:r>
+        <w:rPr>
+          <w:b/>
+          <w:bCs/>
+        </w:rPr>
+        <w:t xml:space="preserve">Network &amp; Internet</w:t>
+      </w:r>
+      <w:r>
+        <w:t xml:space="preserve">.</w:t>
+      </w:r>
+      <w:r>
+        <w:t xml:space="preserve"> </w:t>
+      </w:r>
+      <w:r>
+        <w:t xml:space="preserve">2. Pilih</w:t>
+      </w:r>
+      <w:r>
+        <w:t xml:space="preserve"> </w:t>
+      </w:r>
+      <w:r>
+        <w:rPr>
+          <w:b/>
+          <w:bCs/>
+        </w:rPr>
+        <w:t xml:space="preserve">Advanced network settings</w:t>
+      </w:r>
+      <w:r>
+        <w:t xml:space="preserve"> </w:t>
+      </w:r>
+      <w:r>
+        <w:t xml:space="preserve">&gt;</w:t>
+      </w:r>
+      <w:r>
+        <w:t xml:space="preserve"> </w:t>
+      </w:r>
+      <w:r>
+        <w:rPr>
+          <w:b/>
+          <w:bCs/>
+        </w:rPr>
+        <w:t xml:space="preserve">Advanced sharing settings</w:t>
+      </w:r>
+      <w:r>
+        <w:t xml:space="preserve">.</w:t>
+      </w:r>
+      <w:r>
+        <w:t xml:space="preserve"> </w:t>
+      </w:r>
+      <w:r>
+        <w:t xml:space="preserve">3. Pastikan</w:t>
+      </w:r>
+      <w:r>
+        <w:t xml:space="preserve"> </w:t>
+      </w:r>
+      <w:r>
+        <w:rPr>
+          <w:b/>
+          <w:bCs/>
+        </w:rPr>
+        <w:t xml:space="preserve">Private networks</w:t>
+      </w:r>
+      <w:r>
+        <w:t xml:space="preserve"> </w:t>
+      </w:r>
+      <w:r>
+        <w:t xml:space="preserve">memiliki:</w:t>
+      </w:r>
+      <w:r>
+        <w:t xml:space="preserve"> </w:t>
+      </w:r>
+      <w:r>
+        <w:t xml:space="preserve">-</w:t>
+      </w:r>
+      <w:r>
+        <w:t xml:space="preserve"> </w:t>
+      </w:r>
+      <w:r>
+        <w:rPr>
+          <w:b/>
+          <w:bCs/>
+        </w:rPr>
+        <w:t xml:space="preserve">Network discovery:</w:t>
+      </w:r>
+      <w:r>
+        <w:t xml:space="preserve"> </w:t>
+      </w:r>
+      <w:r>
+        <w:t xml:space="preserve">ON.</w:t>
+      </w:r>
+      <w:r>
+        <w:t xml:space="preserve"> </w:t>
+      </w:r>
+      <w:r>
+        <w:t xml:space="preserve">-</w:t>
+      </w:r>
+      <w:r>
+        <w:t xml:space="preserve"> </w:t>
+      </w:r>
+      <w:r>
+        <w:rPr>
+          <w:b/>
+          <w:bCs/>
+        </w:rPr>
+        <w:t xml:space="preserve">File and printer sharing:</w:t>
+      </w:r>
+      <w:r>
+        <w:t xml:space="preserve"> </w:t>
+      </w:r>
+      <w:r>
+        <w:t xml:space="preserve">ON.</w:t>
+      </w:r>
+      <w:r>
+        <w:t xml:space="preserve"> </w:t>
+      </w:r>
+      <w:r>
+        <w:t xml:space="preserve">4. Di bagian</w:t>
+      </w:r>
+      <w:r>
+        <w:t xml:space="preserve"> </w:t>
+      </w:r>
+      <w:r>
+        <w:rPr>
+          <w:b/>
+          <w:bCs/>
+        </w:rPr>
+        <w:t xml:space="preserve">All networks</w:t>
+      </w:r>
+      <w:r>
+        <w:t xml:space="preserve">, disarankan mematikan</w:t>
+      </w:r>
+      <w:r>
+        <w:t xml:space="preserve"> </w:t>
+      </w:r>
+      <w:r>
+        <w:rPr>
+          <w:b/>
+          <w:bCs/>
+        </w:rPr>
+        <w:t xml:space="preserve">Password protected sharing</w:t>
+      </w:r>
+      <w:r>
+        <w:t xml:space="preserve"> </w:t>
+      </w:r>
+      <w:r>
+        <w:t xml:space="preserve">jika hanya untuk keperluan ujian agar akses lebih mudah.</w:t>
+      </w:r>
+    </w:p>
+    <w:p>
+      <w:r>
+        <w:pict>
+          <v:rect style="width:0;height:1.5pt" o:hralign="center" o:hrstd="t" o:hr="t"/>
+        </w:pict>
+      </w:r>
+    </w:p>
+    <w:bookmarkEnd w:id="52"/>
+    <w:bookmarkStart w:id="56" w:name="sharing-folder-file-sharing"/>
+    <w:p>
+      <w:pPr>
+        <w:pStyle w:val="Heading3"/>
+      </w:pPr>
+      <w:r>
+        <w:t xml:space="preserve">2. Sharing Folder (File Sharing)</w:t>
+      </w:r>
+    </w:p>
+    <w:p>
+      <w:pPr>
+        <w:pStyle w:val="Compact"/>
+        <w:numPr>
+          <w:ilvl w:val="0"/>
+          <w:numId w:val="1010"/>
+        </w:numPr>
+      </w:pPr>
+      <w:r>
+        <w:t xml:space="preserve">Klik kanan pada folder yang ingin dibagikan (misal:</w:t>
+      </w:r>
+      <w:r>
+        <w:t xml:space="preserve"> </w:t>
+      </w:r>
+      <w:r>
+        <w:t xml:space="preserve">“DATA_SISWA”</w:t>
+      </w:r>
+      <w:r>
+        <w:t xml:space="preserve">).</w:t>
+      </w:r>
+    </w:p>
+    <w:p>
+      <w:pPr>
+        <w:pStyle w:val="Compact"/>
+        <w:numPr>
+          <w:ilvl w:val="0"/>
+          <w:numId w:val="1010"/>
+        </w:numPr>
+      </w:pPr>
+      <w:r>
+        <w:t xml:space="preserve">Pilih</w:t>
+      </w:r>
+      <w:r>
+        <w:t xml:space="preserve"> </w:t>
+      </w:r>
+      <w:r>
+        <w:rPr>
+          <w:b/>
+          <w:bCs/>
+        </w:rPr>
+        <w:t xml:space="preserve">Properties</w:t>
+      </w:r>
+      <w:r>
+        <w:t xml:space="preserve"> </w:t>
+      </w:r>
+      <w:r>
+        <w:t xml:space="preserve">&gt; tab</w:t>
+      </w:r>
+      <w:r>
+        <w:t xml:space="preserve"> </w:t>
+      </w:r>
+      <w:r>
+        <w:rPr>
+          <w:b/>
+          <w:bCs/>
+        </w:rPr>
+        <w:t xml:space="preserve">Sharing</w:t>
+      </w:r>
+      <w:r>
+        <w:t xml:space="preserve"> </w:t>
+      </w:r>
+      <w:r>
+        <w:t xml:space="preserve">&gt; klik tombol</w:t>
+      </w:r>
+      <w:r>
+        <w:t xml:space="preserve"> </w:t>
+      </w:r>
+      <w:r>
+        <w:rPr>
+          <w:b/>
+          <w:bCs/>
+        </w:rPr>
+        <w:t xml:space="preserve">Share…</w:t>
+      </w:r>
+      <w:r>
+        <w:t xml:space="preserve">.</w:t>
+      </w:r>
+    </w:p>
+    <w:p>
+      <w:pPr>
+        <w:pStyle w:val="Compact"/>
+        <w:numPr>
+          <w:ilvl w:val="0"/>
+          <w:numId w:val="1010"/>
+        </w:numPr>
+      </w:pPr>
+      <w:r>
+        <w:t xml:space="preserve">Pilih</w:t>
+      </w:r>
+      <w:r>
+        <w:t xml:space="preserve"> </w:t>
+      </w:r>
+      <w:r>
+        <w:rPr>
+          <w:b/>
+          <w:bCs/>
+        </w:rPr>
+        <w:t xml:space="preserve">Everyone</w:t>
+      </w:r>
+      <w:r>
+        <w:t xml:space="preserve"> </w:t>
+      </w:r>
+      <w:r>
+        <w:t xml:space="preserve">dari dropdown, klik</w:t>
+      </w:r>
+      <w:r>
+        <w:t xml:space="preserve"> </w:t>
+      </w:r>
+      <w:r>
+        <w:rPr>
+          <w:b/>
+          <w:bCs/>
+        </w:rPr>
+        <w:t xml:space="preserve">Add</w:t>
+      </w:r>
+      <w:r>
+        <w:t xml:space="preserve">.</w:t>
+      </w:r>
+    </w:p>
+    <w:p>
+      <w:pPr>
+        <w:pStyle w:val="Compact"/>
+        <w:numPr>
+          <w:ilvl w:val="0"/>
+          <w:numId w:val="1010"/>
+        </w:numPr>
+      </w:pPr>
+      <w:r>
+        <w:t xml:space="preserve">Ubah Permission Level menjadi</w:t>
+      </w:r>
+      <w:r>
+        <w:t xml:space="preserve"> </w:t>
+      </w:r>
+      <w:r>
+        <w:rPr>
+          <w:b/>
+          <w:bCs/>
+        </w:rPr>
+        <w:t xml:space="preserve">Read/Write</w:t>
+      </w:r>
+      <w:r>
+        <w:t xml:space="preserve">.</w:t>
+      </w:r>
+    </w:p>
+    <w:p>
+      <w:pPr>
+        <w:pStyle w:val="Compact"/>
+        <w:numPr>
+          <w:ilvl w:val="0"/>
+          <w:numId w:val="1010"/>
+        </w:numPr>
+      </w:pPr>
+      <w:r>
+        <w:t xml:space="preserve">Klik</w:t>
+      </w:r>
+      <w:r>
+        <w:t xml:space="preserve"> </w:t>
+      </w:r>
+      <w:r>
+        <w:rPr>
+          <w:b/>
+          <w:bCs/>
+        </w:rPr>
+        <w:t xml:space="preserve">Share</w:t>
+      </w:r>
+      <w:r>
+        <w:t xml:space="preserve">, lalu</w:t>
+      </w:r>
+      <w:r>
+        <w:t xml:space="preserve"> </w:t>
+      </w:r>
+      <w:r>
+        <w:rPr>
+          <w:b/>
+          <w:bCs/>
+        </w:rPr>
+        <w:t xml:space="preserve">Done</w:t>
+      </w:r>
+      <w:r>
+        <w:t xml:space="preserve">.</w:t>
+      </w:r>
+    </w:p>
+    <w:p>
+      <w:pPr>
+        <w:pStyle w:val="Compact"/>
+        <w:numPr>
+          <w:ilvl w:val="0"/>
+          <w:numId w:val="1010"/>
+        </w:numPr>
+      </w:pPr>
+      <w:r>
+        <w:t xml:space="preserve">Klik</w:t>
+      </w:r>
+      <w:r>
+        <w:t xml:space="preserve"> </w:t>
+      </w:r>
+      <w:r>
+        <w:rPr>
+          <w:b/>
+          <w:bCs/>
+        </w:rPr>
+        <w:t xml:space="preserve">Advanced Sharing…</w:t>
+      </w:r>
+      <w:r>
+        <w:t xml:space="preserve">, centang</w:t>
+      </w:r>
+      <w:r>
+        <w:t xml:space="preserve"> </w:t>
+      </w:r>
+      <w:r>
+        <w:rPr>
+          <w:b/>
+          <w:bCs/>
+        </w:rPr>
+        <w:t xml:space="preserve">Share this folder</w:t>
+      </w:r>
+      <w:r>
+        <w:t xml:space="preserve">, lalu klik</w:t>
+      </w:r>
+      <w:r>
+        <w:t xml:space="preserve"> </w:t>
+      </w:r>
+      <w:r>
+        <w:rPr>
+          <w:b/>
+          <w:bCs/>
+        </w:rPr>
+        <w:t xml:space="preserve">OK</w:t>
+      </w:r>
+      <w:r>
+        <w:t xml:space="preserve">.</w:t>
+      </w:r>
+    </w:p>
+    <w:p>
+      <w:pPr>
+        <w:pStyle w:val="CaptionedFigure"/>
+      </w:pPr>
+      <w:r>
+        <w:drawing>
+          <wp:inline>
+            <wp:extent cx="3810000" cy="2540000"/>
+            <wp:effectExtent b="0" l="0" r="0" t="0"/>
+            <wp:docPr descr="Ilustrasi Menu Sharing Windows 11" title="" id="54" name="Picture"/>
+            <a:graphic>
+              <a:graphicData uri="http://schemas.openxmlformats.org/drawingml/2006/picture">
+                <pic:pic>
+                  <pic:nvPicPr>
+                    <pic:cNvPr descr="https://www.windowscentral.com/sites/wpcentral.com/files/styles/large/public/field/image/2021/10/windows-11-file-sharing-properties.jpg" id="55" name="Picture"/>
+                    <pic:cNvPicPr>
+                      <a:picLocks noChangeArrowheads="1" noChangeAspect="1"/>
+                    </pic:cNvPicPr>
+                  </pic:nvPicPr>
+                  <pic:blipFill>
+                    <a:blip r:embed="rId53"/>
+                    <a:stretch>
+                      <a:fillRect/>
+                    </a:stretch>
+                  </pic:blipFill>
+                  <pic:spPr bwMode="auto">
+                    <a:xfrm>
+                      <a:off x="0" y="0"/>
+                      <a:ext cx="3810000" cy="2540000"/>
+                    </a:xfrm>
+                    <a:prstGeom prst="rect">
+                      <a:avLst/>
+                    </a:prstGeom>
+                    <a:noFill/>
+                    <a:ln w="9525">
+                      <a:noFill/>
+                      <a:headEnd/>
+                      <a:tailEnd/>
+                    </a:ln>
+                  </pic:spPr>
+                </pic:pic>
+              </a:graphicData>
+            </a:graphic>
+          </wp:inline>
+        </w:drawing>
+      </w:r>
+    </w:p>
+    <w:p>
+      <w:pPr>
+        <w:pStyle w:val="ImageCaption"/>
+      </w:pPr>
+      <w:r>
+        <w:t xml:space="preserve">Ilustrasi Menu Sharing Windows 11</w:t>
+      </w:r>
+    </w:p>
+    <w:p>
+      <w:r>
+        <w:pict>
+          <v:rect style="width:0;height:1.5pt" o:hralign="center" o:hrstd="t" o:hr="t"/>
+        </w:pict>
+      </w:r>
+    </w:p>
+    <w:bookmarkEnd w:id="56"/>
+    <w:bookmarkStart w:id="60" w:name="sharing-printer"/>
+    <w:p>
+      <w:pPr>
+        <w:pStyle w:val="Heading3"/>
+      </w:pPr>
+      <w:r>
+        <w:t xml:space="preserve">3. Sharing Printer</w:t>
+      </w:r>
+    </w:p>
+    <w:p>
+      <w:pPr>
+        <w:pStyle w:val="Compact"/>
+        <w:numPr>
+          <w:ilvl w:val="0"/>
+          <w:numId w:val="1011"/>
+        </w:numPr>
+      </w:pPr>
+      <w:r>
+        <w:t xml:space="preserve">Buka</w:t>
+      </w:r>
+      <w:r>
+        <w:t xml:space="preserve"> </w:t>
+      </w:r>
+      <w:r>
+        <w:rPr>
+          <w:b/>
+          <w:bCs/>
+        </w:rPr>
+        <w:t xml:space="preserve">Settings</w:t>
+      </w:r>
+      <w:r>
+        <w:t xml:space="preserve"> </w:t>
+      </w:r>
+      <w:r>
+        <w:t xml:space="preserve">&gt;</w:t>
+      </w:r>
+      <w:r>
+        <w:t xml:space="preserve"> </w:t>
+      </w:r>
+      <w:r>
+        <w:rPr>
+          <w:b/>
+          <w:bCs/>
+        </w:rPr>
+        <w:t xml:space="preserve">Bluetooth &amp; devices</w:t>
+      </w:r>
+      <w:r>
+        <w:t xml:space="preserve"> </w:t>
+      </w:r>
+      <w:r>
+        <w:t xml:space="preserve">&gt;</w:t>
+      </w:r>
+      <w:r>
+        <w:t xml:space="preserve"> </w:t>
+      </w:r>
+      <w:r>
+        <w:rPr>
+          <w:b/>
+          <w:bCs/>
+        </w:rPr>
+        <w:t xml:space="preserve">Printers &amp; scanners</w:t>
+      </w:r>
+      <w:r>
+        <w:t xml:space="preserve">.</w:t>
+      </w:r>
+    </w:p>
+    <w:p>
+      <w:pPr>
+        <w:pStyle w:val="Compact"/>
+        <w:numPr>
+          <w:ilvl w:val="0"/>
+          <w:numId w:val="1011"/>
+        </w:numPr>
+      </w:pPr>
+      <w:r>
+        <w:t xml:space="preserve">Pilih printer yang terpasang, klik</w:t>
+      </w:r>
+      <w:r>
+        <w:t xml:space="preserve"> </w:t>
+      </w:r>
+      <w:r>
+        <w:rPr>
+          <w:b/>
+          <w:bCs/>
+        </w:rPr>
+        <w:t xml:space="preserve">Printer properties</w:t>
+      </w:r>
+      <w:r>
+        <w:t xml:space="preserve">.</w:t>
+      </w:r>
+    </w:p>
+    <w:p>
+      <w:pPr>
+        <w:pStyle w:val="Compact"/>
+        <w:numPr>
+          <w:ilvl w:val="0"/>
+          <w:numId w:val="1011"/>
+        </w:numPr>
+      </w:pPr>
+      <w:r>
+        <w:t xml:space="preserve">Buka tab</w:t>
+      </w:r>
+      <w:r>
+        <w:t xml:space="preserve"> </w:t>
+      </w:r>
+      <w:r>
+        <w:rPr>
+          <w:b/>
+          <w:bCs/>
+        </w:rPr>
+        <w:t xml:space="preserve">Sharing</w:t>
+      </w:r>
+      <w:r>
+        <w:t xml:space="preserve">, centang</w:t>
+      </w:r>
+      <w:r>
+        <w:t xml:space="preserve"> </w:t>
+      </w:r>
+      <w:r>
+        <w:rPr>
+          <w:b/>
+          <w:bCs/>
+        </w:rPr>
+        <w:t xml:space="preserve">Share this printer</w:t>
+      </w:r>
+      <w:r>
+        <w:t xml:space="preserve">.</w:t>
+      </w:r>
+    </w:p>
+    <w:p>
+      <w:pPr>
+        <w:pStyle w:val="Compact"/>
+        <w:numPr>
+          <w:ilvl w:val="0"/>
+          <w:numId w:val="1011"/>
+        </w:numPr>
+      </w:pPr>
+      <w:r>
+        <w:t xml:space="preserve">Beri nama sharing (misal:</w:t>
+      </w:r>
+      <w:r>
+        <w:t xml:space="preserve"> </w:t>
+      </w:r>
+      <w:r>
+        <w:rPr>
+          <w:rStyle w:val="VerbatimChar"/>
+        </w:rPr>
+        <w:t xml:space="preserve">Printer_Ujian</w:t>
+      </w:r>
+      <w:r>
+        <w:t xml:space="preserve">), lalu klik</w:t>
+      </w:r>
+      <w:r>
+        <w:t xml:space="preserve"> </w:t>
+      </w:r>
+      <w:r>
+        <w:rPr>
+          <w:b/>
+          <w:bCs/>
+        </w:rPr>
+        <w:t xml:space="preserve">OK</w:t>
+      </w:r>
+      <w:r>
+        <w:t xml:space="preserve">.</w:t>
+      </w:r>
+    </w:p>
+    <w:p>
+      <w:pPr>
+        <w:pStyle w:val="CaptionedFigure"/>
+      </w:pPr>
+      <w:r>
+        <w:drawing>
+          <wp:inline>
+            <wp:extent cx="3810000" cy="2540000"/>
+            <wp:effectExtent b="0" l="0" r="0" t="0"/>
+            <wp:docPr descr="Ilustrasi Sharing Printer Windows 11" title="" id="58" name="Picture"/>
+            <a:graphic>
+              <a:graphicData uri="http://schemas.openxmlformats.org/drawingml/2006/picture">
+                <pic:pic>
+                  <pic:nvPicPr>
+                    <pic:cNvPr descr="https://www.elevenforum.com/attachments/share_printer-png.10651/" id="59" name="Picture"/>
+                    <pic:cNvPicPr>
+                      <a:picLocks noChangeArrowheads="1" noChangeAspect="1"/>
+                    </pic:cNvPicPr>
+                  </pic:nvPicPr>
+                  <pic:blipFill>
+                    <a:blip r:embed="rId57"/>
+                    <a:stretch>
+                      <a:fillRect/>
+                    </a:stretch>
+                  </pic:blipFill>
+                  <pic:spPr bwMode="auto">
+                    <a:xfrm>
+                      <a:off x="0" y="0"/>
+                      <a:ext cx="3810000" cy="2540000"/>
+                    </a:xfrm>
+                    <a:prstGeom prst="rect">
+                      <a:avLst/>
+                    </a:prstGeom>
+                    <a:noFill/>
+                    <a:ln w="9525">
+                      <a:noFill/>
+                      <a:headEnd/>
+                      <a:tailEnd/>
+                    </a:ln>
+                  </pic:spPr>
+                </pic:pic>
+              </a:graphicData>
+            </a:graphic>
+          </wp:inline>
+        </w:drawing>
+      </w:r>
+    </w:p>
+    <w:p>
+      <w:pPr>
+        <w:pStyle w:val="ImageCaption"/>
+      </w:pPr>
+      <w:r>
+        <w:t xml:space="preserve">Ilustrasi Sharing Printer Windows 11</w:t>
+      </w:r>
+    </w:p>
+    <w:p>
+      <w:r>
+        <w:pict>
+          <v:rect style="width:0;height:1.5pt" o:hralign="center" o:hrstd="t" o:hr="t"/>
+        </w:pict>
+      </w:r>
+    </w:p>
+    <w:bookmarkEnd w:id="60"/>
+    <w:bookmarkStart w:id="61" w:name="cara-mengakses-dari-client"/>
+    <w:p>
+      <w:pPr>
+        <w:pStyle w:val="Heading3"/>
+      </w:pPr>
+      <w:r>
+        <w:t xml:space="preserve">4. Cara Mengakses dari Client</w:t>
+      </w:r>
+    </w:p>
+    <w:p>
+      <w:pPr>
+        <w:pStyle w:val="FirstParagraph"/>
+      </w:pPr>
+      <w:r>
+        <w:t xml:space="preserve">Di PC lain, buka File Explorer dan ketik alamat IP server di address bar:</w:t>
+      </w:r>
+      <w:r>
+        <w:t xml:space="preserve"> </w:t>
+      </w:r>
+      <w:r>
+        <w:rPr>
+          <w:rStyle w:val="VerbatimChar"/>
+        </w:rPr>
+        <w:t xml:space="preserve">\192.168.10.10</w:t>
+      </w:r>
+      <w:r>
+        <w:t xml:space="preserve"> </w:t>
+      </w:r>
+      <w:r>
+        <w:t xml:space="preserve">(Sesuaikan dengan IP Windows Server Anda).</w:t>
+      </w:r>
+      <w:r>
+        <w:t xml:space="preserve"> </w:t>
+      </w:r>
+      <w:r>
+        <w:t xml:space="preserve">Semua folder dan printer yang dibagikan akan muncul di sana.</w:t>
+      </w:r>
+    </w:p>
+    <w:p>
+      <w:pPr>
+        <w:pStyle w:val="BodyText"/>
+      </w:pPr>
+      <w:r>
+        <w:t xml:space="preserve">===</w:t>
+      </w:r>
+      <w:r>
+        <w:t xml:space="preserve"> </w:t>
+      </w:r>
+      <w:r>
+        <w:rPr>
+          <w:b/>
+          <w:bCs/>
+        </w:rPr>
+        <w:t xml:space="preserve">Catatan:</w:t>
+      </w:r>
+      <w:r>
+        <w:t xml:space="preserve"> </w:t>
+      </w:r>
+      <w:r>
+        <w:t xml:space="preserve">Pastikan Windows Firewall tidak memblokir</w:t>
+      </w:r>
+      <w:r>
+        <w:t xml:space="preserve"> </w:t>
+      </w:r>
+      <w:r>
+        <w:t xml:space="preserve">“File and Printer Sharing”</w:t>
+      </w:r>
+      <w:r>
+        <w:t xml:space="preserve">.</w:t>
+      </w:r>
+    </w:p>
+    <w:p>
+      <w:r>
+        <w:br w:type="page"/>
+      </w:r>
+    </w:p>
+    <w:bookmarkEnd w:id="61"/>
+    <w:bookmarkEnd w:id="62"/>
+    <w:bookmarkEnd w:id="63"/>
+    <w:bookmarkStart w:id="75" w:name="panduan-sharing-file-printer---debian-13"/>
+    <w:p>
+      <w:pPr>
+        <w:pStyle w:val="Heading1"/>
+      </w:pPr>
+      <w:r>
+        <w:t xml:space="preserve">Panduan Sharing File &amp; Printer - Debian 13</w:t>
+      </w:r>
+    </w:p>
+    <w:bookmarkStart w:id="74" w:name="konfigurasi-samba-cups-server"/>
+    <w:p>
+      <w:pPr>
+        <w:pStyle w:val="Heading2"/>
+      </w:pPr>
+      <w:r>
+        <w:t xml:space="preserve">Konfigurasi Samba &amp; CUPS Server</w:t>
+      </w:r>
+    </w:p>
+    <w:p>
+      <w:pPr>
+        <w:pStyle w:val="FirstParagraph"/>
+      </w:pPr>
+      <w:r>
+        <w:rPr>
+          <w:b/>
+          <w:bCs/>
+        </w:rPr>
+        <w:t xml:space="preserve">Tujuan:</w:t>
+      </w:r>
+      <w:r>
+        <w:t xml:space="preserve"> </w:t>
+      </w:r>
+      <w:r>
+        <w:t xml:space="preserve">Menggunakan Debian 13 sebagai server file sharing (Samba) dan printer sharing (CUPS) yang bisa diakses oleh client Windows/Linux.</w:t>
+      </w:r>
+    </w:p>
+    <w:p>
+      <w:r>
+        <w:pict>
+          <v:rect style="width:0;height:1.5pt" o:hralign="center" o:hrstd="t" o:hr="t"/>
+        </w:pict>
+      </w:r>
+    </w:p>
+    <w:bookmarkStart w:id="64" w:name="instalasi-samba-cups"/>
+    <w:p>
+      <w:pPr>
+        <w:pStyle w:val="Heading3"/>
+      </w:pPr>
+      <w:r>
+        <w:t xml:space="preserve">1. Instalasi Samba &amp; CUPS</w:t>
+      </w:r>
+    </w:p>
+    <w:p>
+      <w:pPr>
+        <w:pStyle w:val="FirstParagraph"/>
+      </w:pPr>
+      <w:r>
+        <w:t xml:space="preserve">Jalankan perintah berikut di terminal Debian:</w:t>
+      </w:r>
+    </w:p>
+    <w:p>
+      <w:pPr>
+        <w:pStyle w:val="SourceCode"/>
+      </w:pPr>
+      <w:r>
+        <w:rPr>
+          <w:rStyle w:val="FunctionTok"/>
+        </w:rPr>
+        <w:t xml:space="preserve">sudo</w:t>
+      </w:r>
+      <w:r>
+        <w:rPr>
+          <w:rStyle w:val="NormalTok"/>
+        </w:rPr>
+        <w:t xml:space="preserve"> apt update </w:t>
+      </w:r>
+      <w:r>
+        <w:rPr>
+          <w:rStyle w:val="KeywordTok"/>
+        </w:rPr>
+        <w:t xml:space="preserve">&amp;&amp;</w:t>
+      </w:r>
+      <w:r>
+        <w:rPr>
+          <w:rStyle w:val="NormalTok"/>
+        </w:rPr>
+        <w:t xml:space="preserve"> </w:t>
+      </w:r>
+      <w:r>
+        <w:rPr>
+          <w:rStyle w:val="FunctionTok"/>
+        </w:rPr>
+        <w:t xml:space="preserve">sudo</w:t>
+      </w:r>
+      <w:r>
+        <w:rPr>
+          <w:rStyle w:val="NormalTok"/>
+        </w:rPr>
+        <w:t xml:space="preserve"> apt install samba cups </w:t>
+      </w:r>
+      <w:r>
+        <w:rPr>
+          <w:rStyle w:val="AttributeTok"/>
+        </w:rPr>
+        <w:t xml:space="preserve">-y</w:t>
+      </w:r>
+    </w:p>
+    <w:p>
+      <w:r>
+        <w:pict>
+          <v:rect style="width:0;height:1.5pt" o:hralign="center" o:hrstd="t" o:hr="t"/>
+        </w:pict>
+      </w:r>
+    </w:p>
+    <w:bookmarkEnd w:id="64"/>
+    <w:bookmarkStart w:id="68" w:name="konfigurasi-sharing-file-samba"/>
+    <w:p>
+      <w:pPr>
+        <w:pStyle w:val="Heading3"/>
+      </w:pPr>
+      <w:r>
+        <w:t xml:space="preserve">2. Konfigurasi Sharing File (Samba)</w:t>
+      </w:r>
+    </w:p>
+    <w:p>
+      <w:pPr>
+        <w:numPr>
+          <w:ilvl w:val="0"/>
+          <w:numId w:val="1012"/>
+        </w:numPr>
+      </w:pPr>
+      <w:r>
+        <w:rPr>
+          <w:b/>
+          <w:bCs/>
+        </w:rPr>
+        <w:t xml:space="preserve">Buat Folder Sharing:</w:t>
+      </w:r>
+    </w:p>
+    <w:p>
+      <w:pPr>
+        <w:pStyle w:val="SourceCode"/>
+        <w:numPr>
+          <w:ilvl w:val="0"/>
+          <w:numId w:val="1000"/>
+        </w:numPr>
+      </w:pPr>
+      <w:r>
+        <w:rPr>
+          <w:rStyle w:val="FunctionTok"/>
+        </w:rPr>
+        <w:t xml:space="preserve">sudo</w:t>
+      </w:r>
+      <w:r>
+        <w:rPr>
+          <w:rStyle w:val="NormalTok"/>
+        </w:rPr>
+        <w:t xml:space="preserve"> mkdir </w:t>
+      </w:r>
+      <w:r>
+        <w:rPr>
+          <w:rStyle w:val="AttributeTok"/>
+        </w:rPr>
+        <w:t xml:space="preserve">-p</w:t>
+      </w:r>
+      <w:r>
+        <w:rPr>
+          <w:rStyle w:val="NormalTok"/>
+        </w:rPr>
+        <w:t xml:space="preserve"> /srv/sharing/DATA_UKK</w:t>
+      </w:r>
+      <w:r>
+        <w:br/>
+      </w:r>
+      <w:r>
+        <w:rPr>
+          <w:rStyle w:val="FunctionTok"/>
+        </w:rPr>
+        <w:t xml:space="preserve">sudo</w:t>
+      </w:r>
+      <w:r>
+        <w:rPr>
+          <w:rStyle w:val="NormalTok"/>
+        </w:rPr>
+        <w:t xml:space="preserve"> chmod </w:t>
+      </w:r>
+      <w:r>
+        <w:rPr>
+          <w:rStyle w:val="AttributeTok"/>
+        </w:rPr>
+        <w:t xml:space="preserve">-R</w:t>
+      </w:r>
+      <w:r>
+        <w:rPr>
+          <w:rStyle w:val="NormalTok"/>
+        </w:rPr>
+        <w:t xml:space="preserve"> 777 /srv/sharing/DATA_UKK</w:t>
+      </w:r>
+    </w:p>
+    <w:p>
+      <w:pPr>
+        <w:numPr>
+          <w:ilvl w:val="0"/>
+          <w:numId w:val="1012"/>
+        </w:numPr>
+      </w:pPr>
+      <w:r>
+        <w:rPr>
+          <w:b/>
+          <w:bCs/>
+        </w:rPr>
+        <w:t xml:space="preserve">Edit Konfigurasi Samba:</w:t>
+      </w:r>
+    </w:p>
+    <w:p>
+      <w:pPr>
+        <w:pStyle w:val="SourceCode"/>
+        <w:numPr>
+          <w:ilvl w:val="0"/>
+          <w:numId w:val="1000"/>
+        </w:numPr>
+      </w:pPr>
+      <w:r>
+        <w:rPr>
+          <w:rStyle w:val="FunctionTok"/>
+        </w:rPr>
+        <w:t xml:space="preserve">sudo</w:t>
+      </w:r>
+      <w:r>
+        <w:rPr>
+          <w:rStyle w:val="NormalTok"/>
+        </w:rPr>
+        <w:t xml:space="preserve"> nano /etc/samba/smb.conf</w:t>
+      </w:r>
+    </w:p>
+    <w:p>
+      <w:pPr>
+        <w:numPr>
+          <w:ilvl w:val="0"/>
+          <w:numId w:val="1012"/>
+        </w:numPr>
+      </w:pPr>
+      <w:r>
+        <w:rPr>
+          <w:b/>
+          <w:bCs/>
+        </w:rPr>
+        <w:t xml:space="preserve">Tambahkan Konfigurasi di Akhir File:</w:t>
+      </w:r>
+    </w:p>
+    <w:p>
+      <w:pPr>
+        <w:pStyle w:val="SourceCode"/>
+        <w:numPr>
+          <w:ilvl w:val="0"/>
+          <w:numId w:val="1000"/>
+        </w:numPr>
+      </w:pPr>
+      <w:r>
+        <w:rPr>
+          <w:rStyle w:val="KeywordTok"/>
+        </w:rPr>
+        <w:t xml:space="preserve">[DATA_UKK]</w:t>
+      </w:r>
+      <w:r>
+        <w:br/>
+      </w:r>
+      <w:r>
+        <w:rPr>
+          <w:rStyle w:val="DataTypeTok"/>
+        </w:rPr>
+        <w:t xml:space="preserve">path </w:t>
+      </w:r>
+      <w:r>
+        <w:rPr>
+          <w:rStyle w:val="OtherTok"/>
+        </w:rPr>
+        <w:t xml:space="preserve">=</w:t>
+      </w:r>
+      <w:r>
+        <w:rPr>
+          <w:rStyle w:val="StringTok"/>
+        </w:rPr>
+        <w:t xml:space="preserve"> /srv/sharing/DATA_UKK</w:t>
+      </w:r>
+      <w:r>
+        <w:br/>
+      </w:r>
+      <w:r>
+        <w:rPr>
+          <w:rStyle w:val="DataTypeTok"/>
+        </w:rPr>
+        <w:t xml:space="preserve">writable </w:t>
+      </w:r>
+      <w:r>
+        <w:rPr>
+          <w:rStyle w:val="OtherTok"/>
+        </w:rPr>
+        <w:t xml:space="preserve">=</w:t>
+      </w:r>
+      <w:r>
+        <w:rPr>
+          <w:rStyle w:val="StringTok"/>
+        </w:rPr>
+        <w:t xml:space="preserve"> </w:t>
+      </w:r>
+      <w:r>
+        <w:rPr>
+          <w:rStyle w:val="KeywordTok"/>
+        </w:rPr>
+        <w:t xml:space="preserve">yes</w:t>
+      </w:r>
+      <w:r>
+        <w:br/>
+      </w:r>
+      <w:r>
+        <w:rPr>
+          <w:rStyle w:val="DataTypeTok"/>
+        </w:rPr>
+        <w:t xml:space="preserve">browsable </w:t>
+      </w:r>
+      <w:r>
+        <w:rPr>
+          <w:rStyle w:val="OtherTok"/>
+        </w:rPr>
+        <w:t xml:space="preserve">=</w:t>
+      </w:r>
+      <w:r>
+        <w:rPr>
+          <w:rStyle w:val="StringTok"/>
+        </w:rPr>
+        <w:t xml:space="preserve"> </w:t>
+      </w:r>
+      <w:r>
+        <w:rPr>
+          <w:rStyle w:val="KeywordTok"/>
+        </w:rPr>
+        <w:t xml:space="preserve">yes</w:t>
+      </w:r>
+      <w:r>
+        <w:br/>
+      </w:r>
+      <w:r>
+        <w:rPr>
+          <w:rStyle w:val="DataTypeTok"/>
+        </w:rPr>
+        <w:t xml:space="preserve">guest ok </w:t>
+      </w:r>
+      <w:r>
+        <w:rPr>
+          <w:rStyle w:val="OtherTok"/>
+        </w:rPr>
+        <w:t xml:space="preserve">=</w:t>
+      </w:r>
+      <w:r>
+        <w:rPr>
+          <w:rStyle w:val="StringTok"/>
+        </w:rPr>
+        <w:t xml:space="preserve"> </w:t>
+      </w:r>
+      <w:r>
+        <w:rPr>
+          <w:rStyle w:val="KeywordTok"/>
+        </w:rPr>
+        <w:t xml:space="preserve">yes</w:t>
+      </w:r>
+      <w:r>
+        <w:br/>
+      </w:r>
+      <w:r>
+        <w:rPr>
+          <w:rStyle w:val="DataTypeTok"/>
+        </w:rPr>
+        <w:t xml:space="preserve">read only </w:t>
+      </w:r>
+      <w:r>
+        <w:rPr>
+          <w:rStyle w:val="OtherTok"/>
+        </w:rPr>
+        <w:t xml:space="preserve">=</w:t>
+      </w:r>
+      <w:r>
+        <w:rPr>
+          <w:rStyle w:val="StringTok"/>
+        </w:rPr>
+        <w:t xml:space="preserve"> </w:t>
+      </w:r>
+      <w:r>
+        <w:rPr>
+          <w:rStyle w:val="KeywordTok"/>
+        </w:rPr>
+        <w:t xml:space="preserve">no</w:t>
+      </w:r>
+    </w:p>
+    <w:p>
+      <w:pPr>
+        <w:numPr>
+          <w:ilvl w:val="0"/>
+          <w:numId w:val="1012"/>
+        </w:numPr>
+      </w:pPr>
+      <w:r>
+        <w:rPr>
+          <w:b/>
+          <w:bCs/>
+        </w:rPr>
+        <w:t xml:space="preserve">Restart Samba:</w:t>
+      </w:r>
+    </w:p>
+    <w:p>
+      <w:pPr>
+        <w:pStyle w:val="SourceCode"/>
+        <w:numPr>
+          <w:ilvl w:val="0"/>
+          <w:numId w:val="1000"/>
+        </w:numPr>
+      </w:pPr>
+      <w:r>
+        <w:rPr>
+          <w:rStyle w:val="FunctionTok"/>
+        </w:rPr>
+        <w:t xml:space="preserve">sudo</w:t>
+      </w:r>
+      <w:r>
+        <w:rPr>
+          <w:rStyle w:val="NormalTok"/>
+        </w:rPr>
+        <w:t xml:space="preserve"> systemctl restart smbd nmbd</w:t>
+      </w:r>
+    </w:p>
+    <w:p>
+      <w:pPr>
+        <w:pStyle w:val="CaptionedFigure"/>
+      </w:pPr>
+      <w:r>
+        <w:drawing>
+          <wp:inline>
+            <wp:extent cx="3810000" cy="2540000"/>
+            <wp:effectExtent b="0" l="0" r="0" t="0"/>
+            <wp:docPr descr="Samba Config File" title="" id="66" name="Picture"/>
+            <a:graphic>
+              <a:graphicData uri="http://schemas.openxmlformats.org/drawingml/2006/picture">
+                <pic:pic>
+                  <pic:nvPicPr>
+                    <pic:cNvPr descr="https://linuxhint.com/wp-content/uploads/2021/08/samba-linux-debian-smb-conf-1024x600.png" id="67" name="Picture"/>
+                    <pic:cNvPicPr>
+                      <a:picLocks noChangeArrowheads="1" noChangeAspect="1"/>
+                    </pic:cNvPicPr>
+                  </pic:nvPicPr>
+                  <pic:blipFill>
+                    <a:blip r:embed="rId65"/>
+                    <a:stretch>
+                      <a:fillRect/>
+                    </a:stretch>
+                  </pic:blipFill>
+                  <pic:spPr bwMode="auto">
+                    <a:xfrm>
+                      <a:off x="0" y="0"/>
+                      <a:ext cx="3810000" cy="2540000"/>
+                    </a:xfrm>
+                    <a:prstGeom prst="rect">
+                      <a:avLst/>
+                    </a:prstGeom>
+                    <a:noFill/>
+                    <a:ln w="9525">
+                      <a:noFill/>
+                      <a:headEnd/>
+                      <a:tailEnd/>
+                    </a:ln>
+                  </pic:spPr>
+                </pic:pic>
+              </a:graphicData>
+            </a:graphic>
+          </wp:inline>
+        </w:drawing>
+      </w:r>
+    </w:p>
+    <w:p>
+      <w:pPr>
+        <w:pStyle w:val="ImageCaption"/>
+      </w:pPr>
+      <w:r>
+        <w:t xml:space="preserve">Samba Config File</w:t>
+      </w:r>
+    </w:p>
+    <w:p>
+      <w:r>
+        <w:pict>
+          <v:rect style="width:0;height:1.5pt" o:hralign="center" o:hrstd="t" o:hr="t"/>
+        </w:pict>
+      </w:r>
+    </w:p>
+    <w:bookmarkEnd w:id="68"/>
+    <w:bookmarkStart w:id="72" w:name="konfigurasi-sharing-printer-cups"/>
+    <w:p>
+      <w:pPr>
+        <w:pStyle w:val="Heading3"/>
+      </w:pPr>
+      <w:r>
+        <w:t xml:space="preserve">3. Konfigurasi Sharing Printer (CUPS)</w:t>
+      </w:r>
+    </w:p>
+    <w:p>
+      <w:pPr>
+        <w:numPr>
+          <w:ilvl w:val="0"/>
+          <w:numId w:val="1013"/>
+        </w:numPr>
+      </w:pPr>
+      <w:r>
+        <w:rPr>
+          <w:b/>
+          <w:bCs/>
+        </w:rPr>
+        <w:t xml:space="preserve">Izinkan Akses Network pada CUPS:</w:t>
+      </w:r>
+    </w:p>
+    <w:p>
+      <w:pPr>
+        <w:pStyle w:val="SourceCode"/>
+        <w:numPr>
+          <w:ilvl w:val="0"/>
+          <w:numId w:val="1000"/>
+        </w:numPr>
+      </w:pPr>
+      <w:r>
+        <w:rPr>
+          <w:rStyle w:val="FunctionTok"/>
+        </w:rPr>
+        <w:t xml:space="preserve">sudo</w:t>
+      </w:r>
+      <w:r>
+        <w:rPr>
+          <w:rStyle w:val="NormalTok"/>
+        </w:rPr>
+        <w:t xml:space="preserve"> nano /etc/cups/cupsd.conf</w:t>
+      </w:r>
+    </w:p>
+    <w:p>
+      <w:pPr>
+        <w:numPr>
+          <w:ilvl w:val="0"/>
+          <w:numId w:val="1013"/>
+        </w:numPr>
+      </w:pPr>
+      <w:r>
+        <w:rPr>
+          <w:b/>
+          <w:bCs/>
+        </w:rPr>
+        <w:t xml:space="preserve">Ubah Konfigurasi Berikut:</w:t>
+      </w:r>
+    </w:p>
+    <w:p>
+      <w:pPr>
+        <w:pStyle w:val="Compact"/>
+        <w:numPr>
+          <w:ilvl w:val="1"/>
+          <w:numId w:val="1014"/>
+        </w:numPr>
+      </w:pPr>
+      <w:r>
+        <w:t xml:space="preserve">Cari</w:t>
+      </w:r>
+      <w:r>
+        <w:t xml:space="preserve"> </w:t>
+      </w:r>
+      <w:r>
+        <w:rPr>
+          <w:rStyle w:val="VerbatimChar"/>
+        </w:rPr>
+        <w:t xml:space="preserve">Listen localhost:631</w:t>
+      </w:r>
+      <w:r>
+        <w:t xml:space="preserve"> </w:t>
+      </w:r>
+      <w:r>
+        <w:t xml:space="preserve">ubah menjadi</w:t>
+      </w:r>
+      <w:r>
+        <w:t xml:space="preserve"> </w:t>
+      </w:r>
+      <w:r>
+        <w:rPr>
+          <w:rStyle w:val="VerbatimChar"/>
+        </w:rPr>
+        <w:t xml:space="preserve">Listen *:631</w:t>
+      </w:r>
+      <w:r>
+        <w:t xml:space="preserve">.</w:t>
+      </w:r>
+    </w:p>
+    <w:p>
+      <w:pPr>
+        <w:pStyle w:val="Compact"/>
+        <w:numPr>
+          <w:ilvl w:val="1"/>
+          <w:numId w:val="1014"/>
+        </w:numPr>
+      </w:pPr>
+      <w:r>
+        <w:t xml:space="preserve">Di bagian</w:t>
+      </w:r>
+      <w:r>
+        <w:t xml:space="preserve"> </w:t>
+      </w:r>
+      <w:r>
+        <w:rPr>
+          <w:rStyle w:val="VerbatimChar"/>
+        </w:rPr>
+        <w:t xml:space="preserve">&lt;Location /&gt;</w:t>
+      </w:r>
+      <w:r>
+        <w:t xml:space="preserve">, tambahkan baris</w:t>
+      </w:r>
+      <w:r>
+        <w:t xml:space="preserve"> </w:t>
+      </w:r>
+      <w:r>
+        <w:rPr>
+          <w:rStyle w:val="VerbatimChar"/>
+        </w:rPr>
+        <w:t xml:space="preserve">Allow @LOCAL</w:t>
+      </w:r>
+      <w:r>
+        <w:t xml:space="preserve">.</w:t>
+      </w:r>
+    </w:p>
+    <w:p>
+      <w:pPr>
+        <w:pStyle w:val="Compact"/>
+        <w:numPr>
+          <w:ilvl w:val="1"/>
+          <w:numId w:val="1014"/>
+        </w:numPr>
+      </w:pPr>
+      <w:r>
+        <w:t xml:space="preserve">Di bagian</w:t>
+      </w:r>
+      <w:r>
+        <w:t xml:space="preserve"> </w:t>
+      </w:r>
+      <w:r>
+        <w:rPr>
+          <w:rStyle w:val="VerbatimChar"/>
+        </w:rPr>
+        <w:t xml:space="preserve">&lt;Location /printers&gt;</w:t>
+      </w:r>
+      <w:r>
+        <w:t xml:space="preserve">, tambahkan baris</w:t>
+      </w:r>
+      <w:r>
+        <w:t xml:space="preserve"> </w:t>
+      </w:r>
+      <w:r>
+        <w:rPr>
+          <w:rStyle w:val="VerbatimChar"/>
+        </w:rPr>
+        <w:t xml:space="preserve">Allow @LOCAL</w:t>
+      </w:r>
+      <w:r>
+        <w:t xml:space="preserve">.</w:t>
+      </w:r>
+    </w:p>
+    <w:p>
+      <w:pPr>
+        <w:numPr>
+          <w:ilvl w:val="0"/>
+          <w:numId w:val="1013"/>
+        </w:numPr>
+      </w:pPr>
+      <w:r>
+        <w:rPr>
+          <w:b/>
+          <w:bCs/>
+        </w:rPr>
+        <w:t xml:space="preserve">Restart CUPS:</w:t>
+      </w:r>
+    </w:p>
+    <w:p>
+      <w:pPr>
+        <w:pStyle w:val="SourceCode"/>
+        <w:numPr>
+          <w:ilvl w:val="0"/>
+          <w:numId w:val="1000"/>
+        </w:numPr>
+      </w:pPr>
+      <w:r>
+        <w:rPr>
+          <w:rStyle w:val="FunctionTok"/>
+        </w:rPr>
+        <w:t xml:space="preserve">sudo</w:t>
+      </w:r>
+      <w:r>
+        <w:rPr>
+          <w:rStyle w:val="NormalTok"/>
+        </w:rPr>
+        <w:t xml:space="preserve"> systemctl restart cups</w:t>
+      </w:r>
+    </w:p>
+    <w:p>
+      <w:pPr>
+        <w:numPr>
+          <w:ilvl w:val="0"/>
+          <w:numId w:val="1013"/>
+        </w:numPr>
+      </w:pPr>
+      <w:r>
+        <w:rPr>
+          <w:b/>
+          <w:bCs/>
+        </w:rPr>
+        <w:t xml:space="preserve">Setup via Browser:</w:t>
+      </w:r>
+      <w:r>
+        <w:t xml:space="preserve"> </w:t>
+      </w:r>
+      <w:r>
+        <w:t xml:space="preserve">Buka browser di PC lain dan ketik:</w:t>
+      </w:r>
+      <w:r>
+        <w:t xml:space="preserve"> </w:t>
+      </w:r>
+      <w:r>
+        <w:rPr>
+          <w:rStyle w:val="VerbatimChar"/>
+        </w:rPr>
+        <w:t xml:space="preserve">http://[IP_DEBIAN]:631</w:t>
+      </w:r>
+      <w:r>
+        <w:t xml:space="preserve">.</w:t>
+      </w:r>
+      <w:r>
+        <w:t xml:space="preserve"> </w:t>
+      </w:r>
+      <w:r>
+        <w:t xml:space="preserve">Tambahkan printer melalui menu</w:t>
+      </w:r>
+      <w:r>
+        <w:t xml:space="preserve"> </w:t>
+      </w:r>
+      <w:r>
+        <w:rPr>
+          <w:b/>
+          <w:bCs/>
+        </w:rPr>
+        <w:t xml:space="preserve">Administration</w:t>
+      </w:r>
+      <w:r>
+        <w:t xml:space="preserve">.</w:t>
+      </w:r>
+    </w:p>
+    <w:p>
+      <w:pPr>
+        <w:pStyle w:val="CaptionedFigure"/>
+      </w:pPr>
+      <w:r>
+        <w:drawing>
+          <wp:inline>
+            <wp:extent cx="1017766" cy="1017766"/>
+            <wp:effectExtent b="0" l="0" r="0" t="0"/>
+            <wp:docPr descr="CUPS Web Admin" title="" id="70" name="Picture"/>
+            <a:graphic>
+              <a:graphicData uri="http://schemas.openxmlformats.org/drawingml/2006/picture">
+                <pic:pic>
+                  <pic:nvPicPr>
+                    <pic:cNvPr descr="https://www.cups.org/images/cups.png" id="71" name="Picture"/>
+                    <pic:cNvPicPr>
+                      <a:picLocks noChangeArrowheads="1" noChangeAspect="1"/>
+                    </pic:cNvPicPr>
+                  </pic:nvPicPr>
+                  <pic:blipFill>
+                    <a:blip r:embed="rId69"/>
+                    <a:stretch>
+                      <a:fillRect/>
+                    </a:stretch>
+                  </pic:blipFill>
+                  <pic:spPr bwMode="auto">
+                    <a:xfrm>
+                      <a:off x="0" y="0"/>
+                      <a:ext cx="1017766" cy="1017766"/>
+                    </a:xfrm>
+                    <a:prstGeom prst="rect">
+                      <a:avLst/>
+                    </a:prstGeom>
+                    <a:noFill/>
+                    <a:ln w="9525">
+                      <a:noFill/>
+                      <a:headEnd/>
+                      <a:tailEnd/>
+                    </a:ln>
+                  </pic:spPr>
+                </pic:pic>
+              </a:graphicData>
+            </a:graphic>
+          </wp:inline>
+        </w:drawing>
+      </w:r>
+    </w:p>
+    <w:p>
+      <w:pPr>
+        <w:pStyle w:val="ImageCaption"/>
+      </w:pPr>
+      <w:r>
+        <w:t xml:space="preserve">CUPS Web Admin</w:t>
+      </w:r>
+    </w:p>
+    <w:p>
+      <w:r>
+        <w:pict>
+          <v:rect style="width:0;height:1.5pt" o:hralign="center" o:hrstd="t" o:hr="t"/>
+        </w:pict>
+      </w:r>
+    </w:p>
+    <w:bookmarkEnd w:id="72"/>
+    <w:bookmarkStart w:id="73" w:name="cara-mengakses-dari-client-windows"/>
+    <w:p>
+      <w:pPr>
+        <w:pStyle w:val="Heading3"/>
+      </w:pPr>
+      <w:r>
+        <w:t xml:space="preserve">4. Cara Mengakses dari Client Windows</w:t>
+      </w:r>
+    </w:p>
+    <w:p>
+      <w:pPr>
+        <w:pStyle w:val="FirstParagraph"/>
+      </w:pPr>
+      <w:r>
+        <w:t xml:space="preserve">Di File Explorer Windows, ketik alamat IP Debian:</w:t>
+      </w:r>
+      <w:r>
+        <w:t xml:space="preserve"> </w:t>
+      </w:r>
+      <w:r>
+        <w:rPr>
+          <w:rStyle w:val="VerbatimChar"/>
+        </w:rPr>
+        <w:t xml:space="preserve">\192.168.10.11</w:t>
+      </w:r>
+      <w:r>
+        <w:t xml:space="preserve"> </w:t>
+      </w:r>
+      <w:r>
+        <w:t xml:space="preserve">(Sesuaikan dengan IP Debian Server Anda).</w:t>
+      </w:r>
+      <w:r>
+        <w:t xml:space="preserve"> </w:t>
+      </w:r>
+      <w:r>
+        <w:t xml:space="preserve">Anda akan melihat folder</w:t>
+      </w:r>
+      <w:r>
+        <w:t xml:space="preserve"> </w:t>
+      </w:r>
+      <w:r>
+        <w:rPr>
+          <w:rStyle w:val="VerbatimChar"/>
+        </w:rPr>
+        <w:t xml:space="preserve">DATA_UKK</w:t>
+      </w:r>
+      <w:r>
+        <w:t xml:space="preserve"> </w:t>
+      </w:r>
+      <w:r>
+        <w:t xml:space="preserve">dan printer yang telah dibagikan.</w:t>
+      </w:r>
+    </w:p>
+    <w:p>
+      <w:pPr>
+        <w:pStyle w:val="BodyText"/>
+      </w:pPr>
+      <w:r>
+        <w:t xml:space="preserve">===</w:t>
+      </w:r>
+      <w:r>
+        <w:t xml:space="preserve"> </w:t>
+      </w:r>
+      <w:r>
+        <w:rPr>
+          <w:b/>
+          <w:bCs/>
+        </w:rPr>
+        <w:t xml:space="preserve">Catatan:</w:t>
+      </w:r>
+      <w:r>
+        <w:t xml:space="preserve"> </w:t>
+      </w:r>
+      <w:r>
+        <w:t xml:space="preserve">Pastikan Firewall pada Debian (UFW/Iptables) tidak memblokir port 139, 445 (Samba) dan 631 (CUPS).</w:t>
+      </w:r>
+    </w:p>
+    <w:bookmarkEnd w:id="73"/>
+    <w:bookmarkEnd w:id="74"/>
+    <w:bookmarkEnd w:id="75"/>
     <w:sectPr>
       <w:footnotePr>
         <w:numRestart w:val="eachSect"/>
@@ -4580,6 +6332,129 @@
     <w:lvlOverride w:ilvl="8">
       <w:startOverride w:val="1"/>
     </w:lvlOverride>
+  </w:num>
+  <w:num w:numId="1010">
+    <w:abstractNumId w:val="99411"/>
+    <w:lvlOverride w:ilvl="0">
+      <w:startOverride w:val="1"/>
+    </w:lvlOverride>
+    <w:lvlOverride w:ilvl="1">
+      <w:startOverride w:val="1"/>
+    </w:lvlOverride>
+    <w:lvlOverride w:ilvl="2">
+      <w:startOverride w:val="1"/>
+    </w:lvlOverride>
+    <w:lvlOverride w:ilvl="3">
+      <w:startOverride w:val="1"/>
+    </w:lvlOverride>
+    <w:lvlOverride w:ilvl="4">
+      <w:startOverride w:val="1"/>
+    </w:lvlOverride>
+    <w:lvlOverride w:ilvl="5">
+      <w:startOverride w:val="1"/>
+    </w:lvlOverride>
+    <w:lvlOverride w:ilvl="6">
+      <w:startOverride w:val="1"/>
+    </w:lvlOverride>
+    <w:lvlOverride w:ilvl="7">
+      <w:startOverride w:val="1"/>
+    </w:lvlOverride>
+    <w:lvlOverride w:ilvl="8">
+      <w:startOverride w:val="1"/>
+    </w:lvlOverride>
+  </w:num>
+  <w:num w:numId="1011">
+    <w:abstractNumId w:val="99411"/>
+    <w:lvlOverride w:ilvl="0">
+      <w:startOverride w:val="1"/>
+    </w:lvlOverride>
+    <w:lvlOverride w:ilvl="1">
+      <w:startOverride w:val="1"/>
+    </w:lvlOverride>
+    <w:lvlOverride w:ilvl="2">
+      <w:startOverride w:val="1"/>
+    </w:lvlOverride>
+    <w:lvlOverride w:ilvl="3">
+      <w:startOverride w:val="1"/>
+    </w:lvlOverride>
+    <w:lvlOverride w:ilvl="4">
+      <w:startOverride w:val="1"/>
+    </w:lvlOverride>
+    <w:lvlOverride w:ilvl="5">
+      <w:startOverride w:val="1"/>
+    </w:lvlOverride>
+    <w:lvlOverride w:ilvl="6">
+      <w:startOverride w:val="1"/>
+    </w:lvlOverride>
+    <w:lvlOverride w:ilvl="7">
+      <w:startOverride w:val="1"/>
+    </w:lvlOverride>
+    <w:lvlOverride w:ilvl="8">
+      <w:startOverride w:val="1"/>
+    </w:lvlOverride>
+  </w:num>
+  <w:num w:numId="1012">
+    <w:abstractNumId w:val="99411"/>
+    <w:lvlOverride w:ilvl="0">
+      <w:startOverride w:val="1"/>
+    </w:lvlOverride>
+    <w:lvlOverride w:ilvl="1">
+      <w:startOverride w:val="1"/>
+    </w:lvlOverride>
+    <w:lvlOverride w:ilvl="2">
+      <w:startOverride w:val="1"/>
+    </w:lvlOverride>
+    <w:lvlOverride w:ilvl="3">
+      <w:startOverride w:val="1"/>
+    </w:lvlOverride>
+    <w:lvlOverride w:ilvl="4">
+      <w:startOverride w:val="1"/>
+    </w:lvlOverride>
+    <w:lvlOverride w:ilvl="5">
+      <w:startOverride w:val="1"/>
+    </w:lvlOverride>
+    <w:lvlOverride w:ilvl="6">
+      <w:startOverride w:val="1"/>
+    </w:lvlOverride>
+    <w:lvlOverride w:ilvl="7">
+      <w:startOverride w:val="1"/>
+    </w:lvlOverride>
+    <w:lvlOverride w:ilvl="8">
+      <w:startOverride w:val="1"/>
+    </w:lvlOverride>
+  </w:num>
+  <w:num w:numId="1013">
+    <w:abstractNumId w:val="99411"/>
+    <w:lvlOverride w:ilvl="0">
+      <w:startOverride w:val="1"/>
+    </w:lvlOverride>
+    <w:lvlOverride w:ilvl="1">
+      <w:startOverride w:val="1"/>
+    </w:lvlOverride>
+    <w:lvlOverride w:ilvl="2">
+      <w:startOverride w:val="1"/>
+    </w:lvlOverride>
+    <w:lvlOverride w:ilvl="3">
+      <w:startOverride w:val="1"/>
+    </w:lvlOverride>
+    <w:lvlOverride w:ilvl="4">
+      <w:startOverride w:val="1"/>
+    </w:lvlOverride>
+    <w:lvlOverride w:ilvl="5">
+      <w:startOverride w:val="1"/>
+    </w:lvlOverride>
+    <w:lvlOverride w:ilvl="6">
+      <w:startOverride w:val="1"/>
+    </w:lvlOverride>
+    <w:lvlOverride w:ilvl="7">
+      <w:startOverride w:val="1"/>
+    </w:lvlOverride>
+    <w:lvlOverride w:ilvl="8">
+      <w:startOverride w:val="1"/>
+    </w:lvlOverride>
+  </w:num>
+  <w:num w:numId="1014">
+    <w:abstractNumId w:val="991"/>
   </w:num>
 </w:numbering>
 </file>

</xml_diff>